<commit_message>
Update technical report with contents and list of figures
Made-with: Cursor
</commit_message>
<xml_diff>
--- a/paper/OptoGuard_Technical_Report.docx
+++ b/paper/OptoGuard_Technical_Report.docx
@@ -2,6 +2,48 @@
 <file path=word/document.xml><?xml version="1.0" encoding="utf-8"?>
 <w:document xmlns:wpc="http://schemas.microsoft.com/office/word/2010/wordprocessingCanvas" xmlns:mo="http://schemas.microsoft.com/office/mac/office/2008/main" xmlns:mc="http://schemas.openxmlformats.org/markup-compatibility/2006" xmlns:mv="urn:schemas-microsoft-com:mac:vml" xmlns:o="urn:schemas-microsoft-com:office:office" xmlns:r="http://schemas.openxmlformats.org/officeDocument/2006/relationships" xmlns:m="http://schemas.openxmlformats.org/officeDocument/2006/math" xmlns:v="urn:schemas-microsoft-com:vml" xmlns:wp14="http://schemas.microsoft.com/office/word/2010/wordprocessingDrawing" xmlns:wp="http://schemas.openxmlformats.org/drawingml/2006/wordprocessingDrawing" xmlns:w10="urn:schemas-microsoft-com:office:word" xmlns:w="http://schemas.openxmlformats.org/wordprocessingml/2006/main" xmlns:w14="http://schemas.microsoft.com/office/word/2010/wordml" xmlns:wpg="http://schemas.microsoft.com/office/word/2010/wordprocessingGroup" xmlns:wpi="http://schemas.microsoft.com/office/word/2010/wordprocessingInk" xmlns:wne="http://schemas.microsoft.com/office/word/2006/wordml" xmlns:wps="http://schemas.microsoft.com/office/word/2010/wordprocessingShape" mc:Ignorable="w14 wp14">
   <w:body>
+    <w:p>
+      <w:pPr>
+        <w:pStyle w:val="Heading1"/>
+      </w:pPr>
+      <w:r>
+        <w:t>Contents</w:t>
+      </w:r>
+    </w:p>
+    <w:p>
+      <w:r>
+        <w:fldChar w:fldCharType="begin"/>
+        <w:instrText xml:space="preserve">TOC \o "1-2" \h \z \u</w:instrText>
+        <w:fldChar w:fldCharType="separate"/>
+        <w:fldChar w:fldCharType="end"/>
+      </w:r>
+    </w:p>
+    <w:p>
+      <w:r>
+        <w:br w:type="page"/>
+      </w:r>
+    </w:p>
+    <w:p>
+      <w:pPr>
+        <w:pStyle w:val="Heading1"/>
+      </w:pPr>
+      <w:r>
+        <w:t>List of Figures</w:t>
+      </w:r>
+    </w:p>
+    <w:p>
+      <w:r>
+        <w:fldChar w:fldCharType="begin"/>
+        <w:instrText xml:space="preserve">TOC \h \z \c "Figure"</w:instrText>
+        <w:fldChar w:fldCharType="separate"/>
+        <w:fldChar w:fldCharType="end"/>
+      </w:r>
+    </w:p>
+    <w:p>
+      <w:r>
+        <w:br w:type="page"/>
+      </w:r>
+    </w:p>
     <w:p>
       <w:pPr>
         <w:pStyle w:val="Title"/>
@@ -12,31 +54,10 @@
     </w:p>
     <w:p>
       <w:r>
-        <w:t>(Mid-sized skim-optimized technical note)</w:t>
+        <w:t>Technical report on Monte Carlo Dropout-based uncertainty analysis for YOLOv8n under distribution shift.</w:t>
       </w:r>
     </w:p>
     <w:p/>
-    <w:p>
-      <w:pPr>
-        <w:pStyle w:val="Heading1"/>
-      </w:pPr>
-      <w:r>
-        <w:t>1. Proposed Structure and Tone</w:t>
-      </w:r>
-    </w:p>
-    <w:p>
-      <w:r>
-        <w:t>(unchanged — keep as-is)</w:t>
-      </w:r>
-    </w:p>
-    <w:p>
-      <w:pPr>
-        <w:pStyle w:val="Heading1"/>
-      </w:pPr>
-      <w:r>
-        <w:t>2. Draft Technical Report</w:t>
-      </w:r>
-    </w:p>
     <w:p>
       <w:pPr>
         <w:pStyle w:val="Heading1"/>
@@ -455,6 +476,9 @@
       </w:r>
     </w:p>
     <w:p>
+      <w:pPr>
+        <w:pStyle w:val="Caption"/>
+      </w:pPr>
       <w:r>
         <w:t>Figure 1. Uncertainty vs. lighting condition</w:t>
       </w:r>
@@ -497,6 +521,9 @@
     </w:p>
     <w:p/>
     <w:p>
+      <w:pPr>
+        <w:pStyle w:val="Caption"/>
+      </w:pPr>
       <w:r>
         <w:t>Figure 2. Uncertainty vs. occlusion level</w:t>
       </w:r>
@@ -539,6 +566,9 @@
     </w:p>
     <w:p/>
     <w:p>
+      <w:pPr>
+        <w:pStyle w:val="Caption"/>
+      </w:pPr>
       <w:r>
         <w:t>Figure 3. Latency by condition and hardware</w:t>
       </w:r>
@@ -581,6 +611,9 @@
     </w:p>
     <w:p/>
     <w:p>
+      <w:pPr>
+        <w:pStyle w:val="Caption"/>
+      </w:pPr>
       <w:r>
         <w:t>Figure 4. Development timeline (Oct 2025–Mar 2026)</w:t>
       </w:r>

</xml_diff>

<commit_message>
Use static contents and figure lists in report
Made-with: Cursor
</commit_message>
<xml_diff>
--- a/paper/OptoGuard_Technical_Report.docx
+++ b/paper/OptoGuard_Technical_Report.docx
@@ -12,10 +12,57 @@
     </w:p>
     <w:p>
       <w:r>
-        <w:fldChar w:fldCharType="begin"/>
-        <w:instrText xml:space="preserve">TOC \o "1-2" \h \z \u</w:instrText>
-        <w:fldChar w:fldCharType="separate"/>
-        <w:fldChar w:fldCharType="end"/>
+        <w:t>1. Introduction</w:t>
+      </w:r>
+    </w:p>
+    <w:p>
+      <w:r>
+        <w:t>2. Related Work</w:t>
+      </w:r>
+    </w:p>
+    <w:p>
+      <w:r>
+        <w:t>3. Methodology</w:t>
+      </w:r>
+    </w:p>
+    <w:p>
+      <w:r>
+        <w:t>4. Experimental Setup</w:t>
+      </w:r>
+    </w:p>
+    <w:p>
+      <w:r>
+        <w:t>5. Results</w:t>
+      </w:r>
+    </w:p>
+    <w:p>
+      <w:r>
+        <w:t xml:space="preserve">   5.1 Uncertainty Under Occlusion</w:t>
+      </w:r>
+    </w:p>
+    <w:p>
+      <w:r>
+        <w:t xml:space="preserve">   5.2 Uncertainty Under Lighting Variation</w:t>
+      </w:r>
+    </w:p>
+    <w:p>
+      <w:r>
+        <w:t xml:space="preserve">   5.3 Latency on Laptop and Raspberry Pi 5</w:t>
+      </w:r>
+    </w:p>
+    <w:p>
+      <w:r>
+        <w:t xml:space="preserve">   5.4 Development Timeline</w:t>
+      </w:r>
+    </w:p>
+    <w:p>
+      <w:r>
+        <w:t>6. Discussion and Limitations</w:t>
+      </w:r>
+    </w:p>
+    <w:p>
+      <w:r>
+        <w:t>7. Conclusion and Future Work</w:t>
       </w:r>
     </w:p>
     <w:p>
@@ -33,10 +80,22 @@
     </w:p>
     <w:p>
       <w:r>
-        <w:fldChar w:fldCharType="begin"/>
-        <w:instrText xml:space="preserve">TOC \h \z \c "Figure"</w:instrText>
-        <w:fldChar w:fldCharType="separate"/>
-        <w:fldChar w:fldCharType="end"/>
+        <w:t>Figure 1. Uncertainty vs. lighting condition</w:t>
+      </w:r>
+    </w:p>
+    <w:p>
+      <w:r>
+        <w:t>Figure 2. Uncertainty vs. occlusion level</w:t>
+      </w:r>
+    </w:p>
+    <w:p>
+      <w:r>
+        <w:t>Figure 3. Latency by condition and hardware</w:t>
+      </w:r>
+    </w:p>
+    <w:p>
+      <w:r>
+        <w:t>Figure 4. Development timeline (Oct 2025–Mar 2026)</w:t>
       </w:r>
     </w:p>
     <w:p>
@@ -476,9 +535,6 @@
       </w:r>
     </w:p>
     <w:p>
-      <w:pPr>
-        <w:pStyle w:val="Caption"/>
-      </w:pPr>
       <w:r>
         <w:t>Figure 1. Uncertainty vs. lighting condition</w:t>
       </w:r>
@@ -521,9 +577,6 @@
     </w:p>
     <w:p/>
     <w:p>
-      <w:pPr>
-        <w:pStyle w:val="Caption"/>
-      </w:pPr>
       <w:r>
         <w:t>Figure 2. Uncertainty vs. occlusion level</w:t>
       </w:r>
@@ -566,9 +619,6 @@
     </w:p>
     <w:p/>
     <w:p>
-      <w:pPr>
-        <w:pStyle w:val="Caption"/>
-      </w:pPr>
       <w:r>
         <w:t>Figure 3. Latency by condition and hardware</w:t>
       </w:r>
@@ -611,9 +661,6 @@
     </w:p>
     <w:p/>
     <w:p>
-      <w:pPr>
-        <w:pStyle w:val="Caption"/>
-      </w:pPr>
       <w:r>
         <w:t>Figure 4. Development timeline (Oct 2025–Mar 2026)</w:t>
       </w:r>

</xml_diff>